<commit_message>
Updated figures and analysis
</commit_message>
<xml_diff>
--- a/Phil_Trans_MS_v1.docx
+++ b/Phil_Trans_MS_v1.docx
@@ -3053,25 +3053,7 @@
                 <w:lang w:val="en-GB"/>
               </w:rPr>
               <w:lastRenderedPageBreak/>
-              <w:t>(</w:t>
-            </w:r>
-            <w:r>
-              <w:rPr>
-                <w:rFonts w:ascii="Arial" w:hAnsi="Arial" w:cs="Arial"/>
-                <w:sz w:val="22"/>
-                <w:szCs w:val="22"/>
-                <w:lang w:val="en-GB"/>
-              </w:rPr>
-              <w:t>2</w:t>
-            </w:r>
-            <w:r>
-              <w:rPr>
-                <w:rFonts w:ascii="Arial" w:hAnsi="Arial" w:cs="Arial"/>
-                <w:sz w:val="22"/>
-                <w:szCs w:val="22"/>
-                <w:lang w:val="en-GB"/>
-              </w:rPr>
-              <w:t>)</w:t>
+              <w:t>(2)</w:t>
             </w:r>
           </w:p>
         </w:tc>
@@ -3353,13 +3335,8 @@
       <w:r>
         <w:t xml:space="preserve"> hold the maximum fixed at 800 and vary the minimum. </w:t>
       </w:r>
-      <w:proofErr w:type="spellStart"/>
-      <w:r>
-        <w:t>The</w:t>
-      </w:r>
-      <w:proofErr w:type="spellEnd"/>
-      <w:r>
-        <w:t xml:space="preserve"> total immune cell population is fixed at 1200, so the random draw determines both the initial Th1 and Th2 cell numbers.</w:t>
+      <w:r>
+        <w:t>The total immune cell population is fixed at 1200, so the random draw determines both the initial Th1 and Th2 cell numbers.</w:t>
       </w:r>
       <w:r>
         <w:t xml:space="preserve"> </w:t>
@@ -3390,13 +3367,7 @@
         <w:t xml:space="preserve">. When an infected host contacts a susceptible host, the virulence of the new infection is drawn from a lognormal distribution with mean equal to the virulence of the infecting host and a standard deviation equal to half the mean. With this model of inheritance, virulence evolution </w:t>
       </w:r>
       <w:r>
-        <w:t>emerges</w:t>
-      </w:r>
-      <w:r>
-        <w:t xml:space="preserve"> out of the stochastic processes of infection, death, and recovery</w:t>
-      </w:r>
-      <w:r>
-        <w:t xml:space="preserve"> (</w:t>
+        <w:t>emerges out of the stochastic processes of infection, death, and recovery (</w:t>
       </w:r>
       <w:proofErr w:type="spellStart"/>
       <w:r>
@@ -3507,7 +3478,1026 @@
     </w:p>
     <w:p>
       <w:r>
-        <w:t xml:space="preserve">With this intuition developed, we can consider the epidemiological and evolutionary dynamics that result from different immunological landscapes, specified by varying the minimum Th2 of each infection. Fig. 2 shows the epidemiological results. </w:t>
+        <w:t>With this intuition developed, we can consider the epidemiological and evolutionary dynamics that result from different immunological landscapes, specified by varying the minimum Th2 of each infection. Fig. 2 shows the epidemiological results</w:t>
+      </w:r>
+      <w:r>
+        <w:t xml:space="preserve">, highlighting some particularly interesting. In general, we observe a decrease in prevalence as we increase the minimum number of Th2 cells upon infection (main panel), reflecting an increase in the probability of an acute infection with a higher initial Th2 (Fig. 1). The blue points and top left panel show the epidemiological dynamics when the immune system is very likely to be Th1-biased (minimum Th2=200). We observed no epidemic fadeouts and prevalence is nearly 100%. Conversely, the green points and bottom left panel show the epidemiological dynamics when the immune system is Th2-biased (minimum Th2=700). Epidemic fadeouts are </w:t>
+      </w:r>
+      <w:proofErr w:type="gramStart"/>
+      <w:r>
+        <w:t>common</w:t>
+      </w:r>
+      <w:proofErr w:type="gramEnd"/>
+      <w:r>
+        <w:t xml:space="preserve"> and prevalence reaches an approximate steady state around 25%. The orange points and middle left panel show the epidemiological dynamics when there is moderate Th2 bias (minimum Th2=575). Here we observe much more variability in the final prevalence across simulations and it is also clear that we have not yet reached a steady state; this is because the eco-evolutionary dynamics are still occurring (Fig. 3).</w:t>
+      </w:r>
+    </w:p>
+    <w:p/>
+    <w:p>
+      <w:r>
+        <w:t>Evolutionarily, we see that when the immune system is Th1-biased (minimum Th2=200; top left panel of Fig. 3), virulence evolves to be very low as chronic infections are very likely. Conversely, when the immune system is Th2-biased (minimum Th2=700; bottom left panel of Fig. 3), virulence evolves to be high as acute infections are very likely. When there is moderate Th2 bias (minimum Th2=575), the evolutionary outcomes are highly variable; overall, most simulations are evolving towards lower virulence, but many have maintained very high virulence throughout the entire simulation run, implying that virulence evolution is much less predictable. Overall, as the immune system becomes more Th2-biased and acute infections are less likely, parasite virulence evolves to be higher</w:t>
+      </w:r>
+      <w:r>
+        <w:t xml:space="preserve"> (Fig. 3, main panel).</w:t>
+      </w:r>
+    </w:p>
+    <w:p/>
+    <w:p>
+      <w:r>
+        <w:t>Figure 4 visualizes how evolution of virulence across different immune landscapes has modified parasite fitness components.</w:t>
+      </w:r>
+    </w:p>
+    <w:p/>
+    <w:p>
+      <w:r>
+        <w:t xml:space="preserve">Finally, to demonstrate that it is the acute versus chronic infection probability that is driving the evolutionary and epidemiological outcomes, we consider the evolution of virulence in a </w:t>
+      </w:r>
+      <w:proofErr w:type="spellStart"/>
+      <w:r>
+        <w:t>a</w:t>
+      </w:r>
+      <w:proofErr w:type="spellEnd"/>
+      <w:r>
+        <w:t xml:space="preserve"> greatly simplified system: </w:t>
+      </w:r>
+    </w:p>
+    <w:p/>
+    <w:tbl>
+      <w:tblPr>
+        <w:tblStyle w:val="TableGrid"/>
+        <w:tblW w:w="0" w:type="auto"/>
+        <w:tblLook w:val="04A0" w:firstRow="1" w:lastRow="0" w:firstColumn="1" w:lastColumn="0" w:noHBand="0" w:noVBand="1"/>
+      </w:tblPr>
+      <w:tblGrid>
+        <w:gridCol w:w="8865"/>
+        <w:gridCol w:w="485"/>
+      </w:tblGrid>
+      <w:tr>
+        <w:tc>
+          <w:tcPr>
+            <w:tcW w:w="8905" w:type="dxa"/>
+          </w:tcPr>
+          <w:p>
+            <w:pPr>
+              <w:rPr>
+                <w:rFonts w:eastAsiaTheme="minorEastAsia"/>
+                <w:iCs/>
+              </w:rPr>
+            </w:pPr>
+            <m:oMathPara>
+              <m:oMath>
+                <m:f>
+                  <m:fPr>
+                    <m:ctrlPr>
+                      <w:rPr>
+                        <w:rFonts w:ascii="Cambria Math" w:hAnsi="Cambria Math"/>
+                        <w:i/>
+                        <w:iCs/>
+                      </w:rPr>
+                    </m:ctrlPr>
+                  </m:fPr>
+                  <m:num>
+                    <m:r>
+                      <w:rPr>
+                        <w:rFonts w:ascii="Cambria Math" w:hAnsi="Cambria Math"/>
+                      </w:rPr>
+                      <m:t>dS</m:t>
+                    </m:r>
+                  </m:num>
+                  <m:den>
+                    <m:r>
+                      <w:rPr>
+                        <w:rFonts w:ascii="Cambria Math" w:hAnsi="Cambria Math"/>
+                      </w:rPr>
+                      <m:t>dt</m:t>
+                    </m:r>
+                  </m:den>
+                </m:f>
+                <m:r>
+                  <w:rPr>
+                    <w:rFonts w:ascii="Cambria Math" w:hAnsi="Cambria Math"/>
+                  </w:rPr>
+                  <m:t>=b</m:t>
+                </m:r>
+                <m:d>
+                  <m:dPr>
+                    <m:ctrlPr>
+                      <w:rPr>
+                        <w:rFonts w:ascii="Cambria Math" w:hAnsi="Cambria Math"/>
+                        <w:i/>
+                        <w:iCs/>
+                      </w:rPr>
+                    </m:ctrlPr>
+                  </m:dPr>
+                  <m:e>
+                    <m:r>
+                      <w:rPr>
+                        <w:rFonts w:ascii="Cambria Math" w:hAnsi="Cambria Math"/>
+                      </w:rPr>
+                      <m:t>S+I</m:t>
+                    </m:r>
+                  </m:e>
+                </m:d>
+                <m:d>
+                  <m:dPr>
+                    <m:ctrlPr>
+                      <w:rPr>
+                        <w:rFonts w:ascii="Cambria Math" w:hAnsi="Cambria Math"/>
+                        <w:i/>
+                        <w:iCs/>
+                      </w:rPr>
+                    </m:ctrlPr>
+                  </m:dPr>
+                  <m:e>
+                    <m:r>
+                      <w:rPr>
+                        <w:rFonts w:ascii="Cambria Math" w:hAnsi="Cambria Math"/>
+                      </w:rPr>
+                      <m:t>1-</m:t>
+                    </m:r>
+                    <m:f>
+                      <m:fPr>
+                        <m:ctrlPr>
+                          <w:rPr>
+                            <w:rFonts w:ascii="Cambria Math" w:hAnsi="Cambria Math"/>
+                            <w:i/>
+                            <w:iCs/>
+                          </w:rPr>
+                        </m:ctrlPr>
+                      </m:fPr>
+                      <m:num>
+                        <m:r>
+                          <w:rPr>
+                            <w:rFonts w:ascii="Cambria Math" w:hAnsi="Cambria Math"/>
+                          </w:rPr>
+                          <m:t>S+I</m:t>
+                        </m:r>
+                      </m:num>
+                      <m:den>
+                        <m:r>
+                          <w:rPr>
+                            <w:rFonts w:ascii="Cambria Math" w:hAnsi="Cambria Math"/>
+                          </w:rPr>
+                          <m:t>K</m:t>
+                        </m:r>
+                      </m:den>
+                    </m:f>
+                  </m:e>
+                </m:d>
+                <m:r>
+                  <w:rPr>
+                    <w:rFonts w:ascii="Cambria Math" w:hAnsi="Cambria Math"/>
+                  </w:rPr>
+                  <m:t>-β</m:t>
+                </m:r>
+                <m:d>
+                  <m:dPr>
+                    <m:ctrlPr>
+                      <w:rPr>
+                        <w:rFonts w:ascii="Cambria Math" w:hAnsi="Cambria Math"/>
+                        <w:i/>
+                        <w:iCs/>
+                      </w:rPr>
+                    </m:ctrlPr>
+                  </m:dPr>
+                  <m:e>
+                    <m:r>
+                      <w:rPr>
+                        <w:rFonts w:ascii="Cambria Math" w:hAnsi="Cambria Math"/>
+                      </w:rPr>
+                      <m:t>v</m:t>
+                    </m:r>
+                  </m:e>
+                </m:d>
+                <m:r>
+                  <w:rPr>
+                    <w:rFonts w:ascii="Cambria Math" w:hAnsi="Cambria Math"/>
+                  </w:rPr>
+                  <m:t>S</m:t>
+                </m:r>
+                <m:d>
+                  <m:dPr>
+                    <m:ctrlPr>
+                      <w:rPr>
+                        <w:rFonts w:ascii="Cambria Math" w:hAnsi="Cambria Math"/>
+                        <w:i/>
+                        <w:iCs/>
+                      </w:rPr>
+                    </m:ctrlPr>
+                  </m:dPr>
+                  <m:e>
+                    <m:sSub>
+                      <m:sSubPr>
+                        <m:ctrlPr>
+                          <w:rPr>
+                            <w:rFonts w:ascii="Cambria Math" w:hAnsi="Cambria Math"/>
+                            <w:i/>
+                            <w:iCs/>
+                          </w:rPr>
+                        </m:ctrlPr>
+                      </m:sSubPr>
+                      <m:e>
+                        <m:r>
+                          <w:rPr>
+                            <w:rFonts w:ascii="Cambria Math" w:hAnsi="Cambria Math"/>
+                          </w:rPr>
+                          <m:t>I</m:t>
+                        </m:r>
+                      </m:e>
+                      <m:sub>
+                        <m:r>
+                          <w:rPr>
+                            <w:rFonts w:ascii="Cambria Math" w:hAnsi="Cambria Math"/>
+                          </w:rPr>
+                          <m:t>a</m:t>
+                        </m:r>
+                      </m:sub>
+                    </m:sSub>
+                    <m:r>
+                      <w:rPr>
+                        <w:rFonts w:ascii="Cambria Math" w:hAnsi="Cambria Math"/>
+                      </w:rPr>
+                      <m:t>+</m:t>
+                    </m:r>
+                    <m:sSub>
+                      <m:sSubPr>
+                        <m:ctrlPr>
+                          <w:rPr>
+                            <w:rFonts w:ascii="Cambria Math" w:hAnsi="Cambria Math"/>
+                            <w:i/>
+                            <w:iCs/>
+                          </w:rPr>
+                        </m:ctrlPr>
+                      </m:sSubPr>
+                      <m:e>
+                        <m:r>
+                          <w:rPr>
+                            <w:rFonts w:ascii="Cambria Math" w:hAnsi="Cambria Math"/>
+                          </w:rPr>
+                          <m:t>I</m:t>
+                        </m:r>
+                      </m:e>
+                      <m:sub>
+                        <m:r>
+                          <w:rPr>
+                            <w:rFonts w:ascii="Cambria Math" w:hAnsi="Cambria Math"/>
+                          </w:rPr>
+                          <m:t>c</m:t>
+                        </m:r>
+                      </m:sub>
+                    </m:sSub>
+                  </m:e>
+                </m:d>
+                <m:r>
+                  <w:rPr>
+                    <w:rFonts w:ascii="Cambria Math" w:hAnsi="Cambria Math"/>
+                  </w:rPr>
+                  <m:t>+γ</m:t>
+                </m:r>
+                <m:sSub>
+                  <m:sSubPr>
+                    <m:ctrlPr>
+                      <w:rPr>
+                        <w:rFonts w:ascii="Cambria Math" w:hAnsi="Cambria Math"/>
+                        <w:i/>
+                        <w:iCs/>
+                      </w:rPr>
+                    </m:ctrlPr>
+                  </m:sSubPr>
+                  <m:e>
+                    <m:r>
+                      <w:rPr>
+                        <w:rFonts w:ascii="Cambria Math" w:hAnsi="Cambria Math"/>
+                      </w:rPr>
+                      <m:t>I</m:t>
+                    </m:r>
+                  </m:e>
+                  <m:sub>
+                    <m:r>
+                      <w:rPr>
+                        <w:rFonts w:ascii="Cambria Math" w:hAnsi="Cambria Math"/>
+                      </w:rPr>
+                      <m:t>a</m:t>
+                    </m:r>
+                  </m:sub>
+                </m:sSub>
+              </m:oMath>
+            </m:oMathPara>
+          </w:p>
+          <w:p>
+            <w:pPr>
+              <w:rPr>
+                <w:rFonts w:eastAsiaTheme="minorEastAsia"/>
+                <w:iCs/>
+              </w:rPr>
+            </w:pPr>
+            <m:oMathPara>
+              <m:oMath>
+                <m:f>
+                  <m:fPr>
+                    <m:ctrlPr>
+                      <w:rPr>
+                        <w:rFonts w:ascii="Cambria Math" w:eastAsiaTheme="minorEastAsia" w:hAnsi="Cambria Math"/>
+                        <w:i/>
+                        <w:iCs/>
+                      </w:rPr>
+                    </m:ctrlPr>
+                  </m:fPr>
+                  <m:num>
+                    <m:r>
+                      <w:rPr>
+                        <w:rFonts w:ascii="Cambria Math" w:eastAsiaTheme="minorEastAsia" w:hAnsi="Cambria Math"/>
+                      </w:rPr>
+                      <m:t>d</m:t>
+                    </m:r>
+                    <m:sSub>
+                      <m:sSubPr>
+                        <m:ctrlPr>
+                          <w:rPr>
+                            <w:rFonts w:ascii="Cambria Math" w:eastAsiaTheme="minorEastAsia" w:hAnsi="Cambria Math"/>
+                            <w:i/>
+                            <w:iCs/>
+                          </w:rPr>
+                        </m:ctrlPr>
+                      </m:sSubPr>
+                      <m:e>
+                        <m:r>
+                          <w:rPr>
+                            <w:rFonts w:ascii="Cambria Math" w:eastAsiaTheme="minorEastAsia" w:hAnsi="Cambria Math"/>
+                          </w:rPr>
+                          <m:t>I</m:t>
+                        </m:r>
+                      </m:e>
+                      <m:sub>
+                        <m:r>
+                          <w:rPr>
+                            <w:rFonts w:ascii="Cambria Math" w:eastAsiaTheme="minorEastAsia" w:hAnsi="Cambria Math"/>
+                          </w:rPr>
+                          <m:t>a</m:t>
+                        </m:r>
+                      </m:sub>
+                    </m:sSub>
+                  </m:num>
+                  <m:den>
+                    <m:r>
+                      <w:rPr>
+                        <w:rFonts w:ascii="Cambria Math" w:eastAsiaTheme="minorEastAsia" w:hAnsi="Cambria Math"/>
+                      </w:rPr>
+                      <m:t>dt</m:t>
+                    </m:r>
+                  </m:den>
+                </m:f>
+                <m:r>
+                  <w:rPr>
+                    <w:rFonts w:ascii="Cambria Math" w:eastAsiaTheme="minorEastAsia" w:hAnsi="Cambria Math"/>
+                  </w:rPr>
+                  <m:t>=p</m:t>
+                </m:r>
+                <m:r>
+                  <w:rPr>
+                    <w:rFonts w:ascii="Cambria Math" w:hAnsi="Cambria Math"/>
+                  </w:rPr>
+                  <m:t>β(v)S(</m:t>
+                </m:r>
+                <m:sSub>
+                  <m:sSubPr>
+                    <m:ctrlPr>
+                      <w:rPr>
+                        <w:rFonts w:ascii="Cambria Math" w:hAnsi="Cambria Math"/>
+                        <w:i/>
+                        <w:iCs/>
+                      </w:rPr>
+                    </m:ctrlPr>
+                  </m:sSubPr>
+                  <m:e>
+                    <m:r>
+                      <w:rPr>
+                        <w:rFonts w:ascii="Cambria Math" w:hAnsi="Cambria Math"/>
+                      </w:rPr>
+                      <m:t>I</m:t>
+                    </m:r>
+                  </m:e>
+                  <m:sub>
+                    <m:r>
+                      <w:rPr>
+                        <w:rFonts w:ascii="Cambria Math" w:hAnsi="Cambria Math"/>
+                      </w:rPr>
+                      <m:t>a</m:t>
+                    </m:r>
+                  </m:sub>
+                </m:sSub>
+                <m:r>
+                  <w:rPr>
+                    <w:rFonts w:ascii="Cambria Math" w:hAnsi="Cambria Math"/>
+                  </w:rPr>
+                  <m:t>+</m:t>
+                </m:r>
+                <m:sSub>
+                  <m:sSubPr>
+                    <m:ctrlPr>
+                      <w:rPr>
+                        <w:rFonts w:ascii="Cambria Math" w:hAnsi="Cambria Math"/>
+                        <w:i/>
+                        <w:iCs/>
+                      </w:rPr>
+                    </m:ctrlPr>
+                  </m:sSubPr>
+                  <m:e>
+                    <m:r>
+                      <w:rPr>
+                        <w:rFonts w:ascii="Cambria Math" w:hAnsi="Cambria Math"/>
+                      </w:rPr>
+                      <m:t>I</m:t>
+                    </m:r>
+                  </m:e>
+                  <m:sub>
+                    <m:r>
+                      <w:rPr>
+                        <w:rFonts w:ascii="Cambria Math" w:hAnsi="Cambria Math"/>
+                      </w:rPr>
+                      <m:t>c</m:t>
+                    </m:r>
+                  </m:sub>
+                </m:sSub>
+                <m:r>
+                  <w:rPr>
+                    <w:rFonts w:ascii="Cambria Math" w:hAnsi="Cambria Math"/>
+                  </w:rPr>
+                  <m:t>)</m:t>
+                </m:r>
+                <m:r>
+                  <w:rPr>
+                    <w:rFonts w:ascii="Cambria Math" w:eastAsiaTheme="minorEastAsia" w:hAnsi="Cambria Math"/>
+                  </w:rPr>
+                  <m:t>-v</m:t>
+                </m:r>
+                <m:sSub>
+                  <m:sSubPr>
+                    <m:ctrlPr>
+                      <w:rPr>
+                        <w:rFonts w:ascii="Cambria Math" w:eastAsiaTheme="minorEastAsia" w:hAnsi="Cambria Math"/>
+                        <w:i/>
+                        <w:iCs/>
+                      </w:rPr>
+                    </m:ctrlPr>
+                  </m:sSubPr>
+                  <m:e>
+                    <m:r>
+                      <w:rPr>
+                        <w:rFonts w:ascii="Cambria Math" w:eastAsiaTheme="minorEastAsia" w:hAnsi="Cambria Math"/>
+                      </w:rPr>
+                      <m:t>I</m:t>
+                    </m:r>
+                  </m:e>
+                  <m:sub>
+                    <m:r>
+                      <w:rPr>
+                        <w:rFonts w:ascii="Cambria Math" w:eastAsiaTheme="minorEastAsia" w:hAnsi="Cambria Math"/>
+                      </w:rPr>
+                      <m:t>a</m:t>
+                    </m:r>
+                  </m:sub>
+                </m:sSub>
+                <m:r>
+                  <w:rPr>
+                    <w:rFonts w:ascii="Cambria Math" w:eastAsiaTheme="minorEastAsia" w:hAnsi="Cambria Math"/>
+                  </w:rPr>
+                  <m:t>-γ</m:t>
+                </m:r>
+                <m:sSub>
+                  <m:sSubPr>
+                    <m:ctrlPr>
+                      <w:rPr>
+                        <w:rFonts w:ascii="Cambria Math" w:eastAsiaTheme="minorEastAsia" w:hAnsi="Cambria Math"/>
+                        <w:i/>
+                        <w:iCs/>
+                      </w:rPr>
+                    </m:ctrlPr>
+                  </m:sSubPr>
+                  <m:e>
+                    <m:r>
+                      <w:rPr>
+                        <w:rFonts w:ascii="Cambria Math" w:eastAsiaTheme="minorEastAsia" w:hAnsi="Cambria Math"/>
+                      </w:rPr>
+                      <m:t>I</m:t>
+                    </m:r>
+                  </m:e>
+                  <m:sub>
+                    <m:r>
+                      <w:rPr>
+                        <w:rFonts w:ascii="Cambria Math" w:eastAsiaTheme="minorEastAsia" w:hAnsi="Cambria Math"/>
+                      </w:rPr>
+                      <m:t>a</m:t>
+                    </m:r>
+                  </m:sub>
+                </m:sSub>
+              </m:oMath>
+            </m:oMathPara>
+          </w:p>
+          <w:p>
+            <w:pPr>
+              <w:rPr>
+                <w:rFonts w:eastAsiaTheme="minorEastAsia"/>
+                <w:iCs/>
+              </w:rPr>
+            </w:pPr>
+            <m:oMathPara>
+              <m:oMath>
+                <m:f>
+                  <m:fPr>
+                    <m:ctrlPr>
+                      <w:rPr>
+                        <w:rFonts w:ascii="Cambria Math" w:eastAsiaTheme="minorEastAsia" w:hAnsi="Cambria Math"/>
+                        <w:i/>
+                        <w:iCs/>
+                      </w:rPr>
+                    </m:ctrlPr>
+                  </m:fPr>
+                  <m:num>
+                    <m:r>
+                      <w:rPr>
+                        <w:rFonts w:ascii="Cambria Math" w:eastAsiaTheme="minorEastAsia" w:hAnsi="Cambria Math"/>
+                      </w:rPr>
+                      <m:t>d</m:t>
+                    </m:r>
+                    <m:sSub>
+                      <m:sSubPr>
+                        <m:ctrlPr>
+                          <w:rPr>
+                            <w:rFonts w:ascii="Cambria Math" w:eastAsiaTheme="minorEastAsia" w:hAnsi="Cambria Math"/>
+                            <w:i/>
+                            <w:iCs/>
+                          </w:rPr>
+                        </m:ctrlPr>
+                      </m:sSubPr>
+                      <m:e>
+                        <m:r>
+                          <w:rPr>
+                            <w:rFonts w:ascii="Cambria Math" w:eastAsiaTheme="minorEastAsia" w:hAnsi="Cambria Math"/>
+                          </w:rPr>
+                          <m:t>I</m:t>
+                        </m:r>
+                      </m:e>
+                      <m:sub>
+                        <m:r>
+                          <w:rPr>
+                            <w:rFonts w:ascii="Cambria Math" w:eastAsiaTheme="minorEastAsia" w:hAnsi="Cambria Math"/>
+                          </w:rPr>
+                          <m:t>c</m:t>
+                        </m:r>
+                      </m:sub>
+                    </m:sSub>
+                  </m:num>
+                  <m:den>
+                    <m:r>
+                      <w:rPr>
+                        <w:rFonts w:ascii="Cambria Math" w:eastAsiaTheme="minorEastAsia" w:hAnsi="Cambria Math"/>
+                      </w:rPr>
+                      <m:t>dt</m:t>
+                    </m:r>
+                  </m:den>
+                </m:f>
+                <m:r>
+                  <w:rPr>
+                    <w:rFonts w:ascii="Cambria Math" w:eastAsiaTheme="minorEastAsia" w:hAnsi="Cambria Math"/>
+                  </w:rPr>
+                  <m:t>=</m:t>
+                </m:r>
+                <m:d>
+                  <m:dPr>
+                    <m:ctrlPr>
+                      <w:rPr>
+                        <w:rFonts w:ascii="Cambria Math" w:eastAsiaTheme="minorEastAsia" w:hAnsi="Cambria Math"/>
+                        <w:i/>
+                        <w:iCs/>
+                      </w:rPr>
+                    </m:ctrlPr>
+                  </m:dPr>
+                  <m:e>
+                    <m:r>
+                      <w:rPr>
+                        <w:rFonts w:ascii="Cambria Math" w:eastAsiaTheme="minorEastAsia" w:hAnsi="Cambria Math"/>
+                      </w:rPr>
+                      <m:t>1-p</m:t>
+                    </m:r>
+                  </m:e>
+                </m:d>
+                <m:r>
+                  <w:rPr>
+                    <w:rFonts w:ascii="Cambria Math" w:eastAsiaTheme="minorEastAsia" w:hAnsi="Cambria Math"/>
+                  </w:rPr>
+                  <m:t>β</m:t>
+                </m:r>
+                <m:d>
+                  <m:dPr>
+                    <m:ctrlPr>
+                      <w:rPr>
+                        <w:rFonts w:ascii="Cambria Math" w:eastAsiaTheme="minorEastAsia" w:hAnsi="Cambria Math"/>
+                        <w:i/>
+                        <w:iCs/>
+                      </w:rPr>
+                    </m:ctrlPr>
+                  </m:dPr>
+                  <m:e>
+                    <m:r>
+                      <w:rPr>
+                        <w:rFonts w:ascii="Cambria Math" w:eastAsiaTheme="minorEastAsia" w:hAnsi="Cambria Math"/>
+                      </w:rPr>
+                      <m:t>v</m:t>
+                    </m:r>
+                  </m:e>
+                </m:d>
+                <m:r>
+                  <w:rPr>
+                    <w:rFonts w:ascii="Cambria Math" w:eastAsiaTheme="minorEastAsia" w:hAnsi="Cambria Math"/>
+                  </w:rPr>
+                  <m:t>S</m:t>
+                </m:r>
+                <m:d>
+                  <m:dPr>
+                    <m:ctrlPr>
+                      <w:rPr>
+                        <w:rFonts w:ascii="Cambria Math" w:eastAsiaTheme="minorEastAsia" w:hAnsi="Cambria Math"/>
+                        <w:i/>
+                        <w:iCs/>
+                      </w:rPr>
+                    </m:ctrlPr>
+                  </m:dPr>
+                  <m:e>
+                    <m:sSub>
+                      <m:sSubPr>
+                        <m:ctrlPr>
+                          <w:rPr>
+                            <w:rFonts w:ascii="Cambria Math" w:eastAsiaTheme="minorEastAsia" w:hAnsi="Cambria Math"/>
+                            <w:i/>
+                            <w:iCs/>
+                          </w:rPr>
+                        </m:ctrlPr>
+                      </m:sSubPr>
+                      <m:e>
+                        <m:r>
+                          <w:rPr>
+                            <w:rFonts w:ascii="Cambria Math" w:eastAsiaTheme="minorEastAsia" w:hAnsi="Cambria Math"/>
+                          </w:rPr>
+                          <m:t>I</m:t>
+                        </m:r>
+                      </m:e>
+                      <m:sub>
+                        <m:r>
+                          <w:rPr>
+                            <w:rFonts w:ascii="Cambria Math" w:eastAsiaTheme="minorEastAsia" w:hAnsi="Cambria Math"/>
+                          </w:rPr>
+                          <m:t>a</m:t>
+                        </m:r>
+                      </m:sub>
+                    </m:sSub>
+                    <m:r>
+                      <w:rPr>
+                        <w:rFonts w:ascii="Cambria Math" w:eastAsiaTheme="minorEastAsia" w:hAnsi="Cambria Math"/>
+                      </w:rPr>
+                      <m:t>+</m:t>
+                    </m:r>
+                    <m:sSub>
+                      <m:sSubPr>
+                        <m:ctrlPr>
+                          <w:rPr>
+                            <w:rFonts w:ascii="Cambria Math" w:eastAsiaTheme="minorEastAsia" w:hAnsi="Cambria Math"/>
+                            <w:i/>
+                            <w:iCs/>
+                          </w:rPr>
+                        </m:ctrlPr>
+                      </m:sSubPr>
+                      <m:e>
+                        <m:r>
+                          <w:rPr>
+                            <w:rFonts w:ascii="Cambria Math" w:eastAsiaTheme="minorEastAsia" w:hAnsi="Cambria Math"/>
+                          </w:rPr>
+                          <m:t>I</m:t>
+                        </m:r>
+                      </m:e>
+                      <m:sub>
+                        <m:r>
+                          <w:rPr>
+                            <w:rFonts w:ascii="Cambria Math" w:eastAsiaTheme="minorEastAsia" w:hAnsi="Cambria Math"/>
+                          </w:rPr>
+                          <m:t>c</m:t>
+                        </m:r>
+                      </m:sub>
+                    </m:sSub>
+                  </m:e>
+                </m:d>
+                <m:r>
+                  <w:rPr>
+                    <w:rFonts w:ascii="Cambria Math" w:eastAsiaTheme="minorEastAsia" w:hAnsi="Cambria Math"/>
+                  </w:rPr>
+                  <m:t>-v</m:t>
+                </m:r>
+                <m:sSub>
+                  <m:sSubPr>
+                    <m:ctrlPr>
+                      <w:rPr>
+                        <w:rFonts w:ascii="Cambria Math" w:eastAsiaTheme="minorEastAsia" w:hAnsi="Cambria Math"/>
+                        <w:i/>
+                        <w:iCs/>
+                      </w:rPr>
+                    </m:ctrlPr>
+                  </m:sSubPr>
+                  <m:e>
+                    <m:r>
+                      <w:rPr>
+                        <w:rFonts w:ascii="Cambria Math" w:eastAsiaTheme="minorEastAsia" w:hAnsi="Cambria Math"/>
+                      </w:rPr>
+                      <m:t>I</m:t>
+                    </m:r>
+                  </m:e>
+                  <m:sub>
+                    <m:r>
+                      <w:rPr>
+                        <w:rFonts w:ascii="Cambria Math" w:eastAsiaTheme="minorEastAsia" w:hAnsi="Cambria Math"/>
+                      </w:rPr>
+                      <m:t>c</m:t>
+                    </m:r>
+                  </m:sub>
+                </m:sSub>
+              </m:oMath>
+            </m:oMathPara>
+          </w:p>
+        </w:tc>
+        <w:tc>
+          <w:tcPr>
+            <w:tcW w:w="445" w:type="dxa"/>
+          </w:tcPr>
+          <w:p>
+            <w:pPr>
+              <w:jc w:val="center"/>
+              <w:rPr>
+                <w:rFonts w:ascii="Arial" w:hAnsi="Arial" w:cs="Arial"/>
+                <w:sz w:val="22"/>
+                <w:szCs w:val="22"/>
+                <w:lang w:val="en-GB"/>
+              </w:rPr>
+            </w:pPr>
+            <w:r>
+              <w:rPr>
+                <w:rFonts w:ascii="Arial" w:hAnsi="Arial" w:cs="Arial"/>
+                <w:sz w:val="22"/>
+                <w:szCs w:val="22"/>
+                <w:lang w:val="en-GB"/>
+              </w:rPr>
+              <w:t>(3)</w:t>
+            </w:r>
+          </w:p>
+        </w:tc>
+      </w:tr>
+    </w:tbl>
+    <w:p/>
+    <w:p>
+      <w:pPr>
+        <w:rPr>
+          <w:rFonts w:eastAsiaTheme="minorEastAsia"/>
+        </w:rPr>
+      </w:pPr>
+      <w:r>
+        <w:t>In this model, infected hosts are either acutely infected (</w:t>
+      </w:r>
+      <m:oMath>
+        <m:sSub>
+          <m:sSubPr>
+            <m:ctrlPr>
+              <w:rPr>
+                <w:rFonts w:ascii="Cambria Math" w:hAnsi="Cambria Math"/>
+                <w:i/>
+              </w:rPr>
+            </m:ctrlPr>
+          </m:sSubPr>
+          <m:e>
+            <m:r>
+              <w:rPr>
+                <w:rFonts w:ascii="Cambria Math" w:hAnsi="Cambria Math"/>
+              </w:rPr>
+              <m:t>I</m:t>
+            </m:r>
+          </m:e>
+          <m:sub>
+            <m:r>
+              <w:rPr>
+                <w:rFonts w:ascii="Cambria Math" w:hAnsi="Cambria Math"/>
+              </w:rPr>
+              <m:t>a</m:t>
+            </m:r>
+          </m:sub>
+        </m:sSub>
+      </m:oMath>
+      <w:r>
+        <w:rPr>
+          <w:rFonts w:eastAsiaTheme="minorEastAsia"/>
+        </w:rPr>
+        <w:t>) or chronically infected (</w:t>
+      </w:r>
+      <m:oMath>
+        <m:sSub>
+          <m:sSubPr>
+            <m:ctrlPr>
+              <w:rPr>
+                <w:rFonts w:ascii="Cambria Math" w:eastAsiaTheme="minorEastAsia" w:hAnsi="Cambria Math"/>
+                <w:i/>
+              </w:rPr>
+            </m:ctrlPr>
+          </m:sSubPr>
+          <m:e>
+            <m:r>
+              <w:rPr>
+                <w:rFonts w:ascii="Cambria Math" w:eastAsiaTheme="minorEastAsia" w:hAnsi="Cambria Math"/>
+              </w:rPr>
+              <m:t>I</m:t>
+            </m:r>
+          </m:e>
+          <m:sub>
+            <m:r>
+              <w:rPr>
+                <w:rFonts w:ascii="Cambria Math" w:eastAsiaTheme="minorEastAsia" w:hAnsi="Cambria Math"/>
+              </w:rPr>
+              <m:t>c</m:t>
+            </m:r>
+          </m:sub>
+        </m:sSub>
+      </m:oMath>
+      <w:r>
+        <w:rPr>
+          <w:rFonts w:eastAsiaTheme="minorEastAsia"/>
+        </w:rPr>
+        <w:t>), with the probability of entering either infected class determined at infection (</w:t>
+      </w:r>
+      <m:oMath>
+        <m:r>
+          <w:rPr>
+            <w:rFonts w:ascii="Cambria Math" w:eastAsiaTheme="minorEastAsia" w:hAnsi="Cambria Math"/>
+          </w:rPr>
+          <m:t>p</m:t>
+        </m:r>
+      </m:oMath>
+      <w:r>
+        <w:rPr>
+          <w:rFonts w:eastAsiaTheme="minorEastAsia"/>
+        </w:rPr>
+        <w:t xml:space="preserve">), independent of the virulence of the parasite. Acutely infected hosts die from infection at a rate </w:t>
+      </w:r>
+      <m:oMath>
+        <m:r>
+          <w:rPr>
+            <w:rFonts w:ascii="Cambria Math" w:eastAsiaTheme="minorEastAsia" w:hAnsi="Cambria Math"/>
+          </w:rPr>
+          <m:t>v</m:t>
+        </m:r>
+      </m:oMath>
+      <w:r>
+        <w:rPr>
+          <w:rFonts w:eastAsiaTheme="minorEastAsia"/>
+        </w:rPr>
+        <w:t xml:space="preserve"> and recover at a rate </w:t>
+      </w:r>
+      <m:oMath>
+        <m:r>
+          <w:rPr>
+            <w:rFonts w:ascii="Cambria Math" w:eastAsiaTheme="minorEastAsia" w:hAnsi="Cambria Math"/>
+          </w:rPr>
+          <m:t>γ</m:t>
+        </m:r>
+      </m:oMath>
+      <w:r>
+        <w:rPr>
+          <w:rFonts w:eastAsiaTheme="minorEastAsia"/>
+        </w:rPr>
+        <w:t>. We assume a classic virulence—transmission trade-off, such that the transmission rate depends on virulence according to the function</w:t>
+      </w:r>
+    </w:p>
+    <w:p>
+      <w:pPr>
+        <w:rPr>
+          <w:rFonts w:eastAsiaTheme="minorEastAsia"/>
+        </w:rPr>
+      </w:pPr>
+      <m:oMathPara>
+        <m:oMath>
+          <m:r>
+            <w:rPr>
+              <w:rFonts w:ascii="Cambria Math" w:eastAsiaTheme="minorEastAsia" w:hAnsi="Cambria Math"/>
+            </w:rPr>
+            <m:t>β</m:t>
+          </m:r>
+          <m:d>
+            <m:dPr>
+              <m:ctrlPr>
+                <w:rPr>
+                  <w:rFonts w:ascii="Cambria Math" w:eastAsiaTheme="minorEastAsia" w:hAnsi="Cambria Math"/>
+                  <w:i/>
+                </w:rPr>
+              </m:ctrlPr>
+            </m:dPr>
+            <m:e>
+              <m:r>
+                <w:rPr>
+                  <w:rFonts w:ascii="Cambria Math" w:eastAsiaTheme="minorEastAsia" w:hAnsi="Cambria Math"/>
+                </w:rPr>
+                <m:t>v</m:t>
+              </m:r>
+            </m:e>
+          </m:d>
+          <m:r>
+            <w:rPr>
+              <w:rFonts w:ascii="Cambria Math" w:eastAsiaTheme="minorEastAsia" w:hAnsi="Cambria Math"/>
+            </w:rPr>
+            <m:t>=</m:t>
+          </m:r>
+          <m:f>
+            <m:fPr>
+              <m:ctrlPr>
+                <w:rPr>
+                  <w:rFonts w:ascii="Cambria Math" w:eastAsiaTheme="minorEastAsia" w:hAnsi="Cambria Math"/>
+                  <w:i/>
+                </w:rPr>
+              </m:ctrlPr>
+            </m:fPr>
+            <m:num>
+              <m:r>
+                <w:rPr>
+                  <w:rFonts w:ascii="Cambria Math" w:eastAsiaTheme="minorEastAsia" w:hAnsi="Cambria Math"/>
+                </w:rPr>
+                <m:t>v</m:t>
+              </m:r>
+            </m:num>
+            <m:den>
+              <m:r>
+                <w:rPr>
+                  <w:rFonts w:ascii="Cambria Math" w:eastAsiaTheme="minorEastAsia" w:hAnsi="Cambria Math"/>
+                </w:rPr>
+                <m:t>1+v</m:t>
+              </m:r>
+            </m:den>
+          </m:f>
+          <m:r>
+            <w:rPr>
+              <w:rFonts w:ascii="Cambria Math" w:eastAsiaTheme="minorEastAsia" w:hAnsi="Cambria Math"/>
+            </w:rPr>
+            <m:t>.</m:t>
+          </m:r>
+        </m:oMath>
+      </m:oMathPara>
+    </w:p>
+    <w:p>
+      <w:pPr>
+        <w:rPr>
+          <w:rFonts w:eastAsiaTheme="minorEastAsia"/>
+        </w:rPr>
+      </w:pPr>
+      <w:r>
+        <w:rPr>
+          <w:rFonts w:eastAsiaTheme="minorEastAsia"/>
+        </w:rPr>
+        <w:t xml:space="preserve">Note that this is much simpler than our current system, where virulence influences transmission, recovery, and duration of infection. </w:t>
+      </w:r>
+    </w:p>
+    <w:p>
+      <w:pPr>
+        <w:rPr>
+          <w:rFonts w:eastAsiaTheme="minorEastAsia"/>
+        </w:rPr>
+      </w:pPr>
+    </w:p>
+    <w:p>
+      <w:r>
+        <w:rPr>
+          <w:rFonts w:eastAsiaTheme="minorEastAsia"/>
+        </w:rPr>
+        <w:t xml:space="preserve">We use an adaptive dynamics analysis to study the evolution of virulence </w:t>
+      </w:r>
+      <m:oMath>
+        <m:r>
+          <w:rPr>
+            <w:rFonts w:ascii="Cambria Math" w:eastAsiaTheme="minorEastAsia" w:hAnsi="Cambria Math"/>
+          </w:rPr>
+          <m:t>v</m:t>
+        </m:r>
+      </m:oMath>
+      <w:r>
+        <w:rPr>
+          <w:rFonts w:eastAsiaTheme="minorEastAsia"/>
+        </w:rPr>
+        <w:t xml:space="preserve"> in this system (</w:t>
+      </w:r>
+      <w:proofErr w:type="spellStart"/>
+      <w:r>
+        <w:rPr>
+          <w:rFonts w:eastAsiaTheme="minorEastAsia"/>
+        </w:rPr>
+        <w:t>Geritz</w:t>
+      </w:r>
+      <w:proofErr w:type="spellEnd"/>
+      <w:r>
+        <w:rPr>
+          <w:rFonts w:eastAsiaTheme="minorEastAsia"/>
+        </w:rPr>
+        <w:t xml:space="preserve"> et al. 1997; see details in Supplementary Information).</w:t>
       </w:r>
     </w:p>
     <w:p/>
@@ -3519,7 +4509,6 @@
     <w:p/>
     <w:p/>
     <w:p/>
-    <w:p/>
     <w:p>
       <w:r>
         <w:rPr>
@@ -3527,9 +4516,9 @@
         </w:rPr>
         <w:lastRenderedPageBreak/>
         <w:drawing>
-          <wp:inline distT="0" distB="0" distL="0" distR="0" wp14:anchorId="57D40406" wp14:editId="1302D053">
-            <wp:extent cx="5878195" cy="8229600"/>
-            <wp:effectExtent l="0" t="0" r="1905" b="0"/>
+          <wp:inline distT="0" distB="0" distL="0" distR="0" wp14:anchorId="57D40406" wp14:editId="0A2E1106">
+            <wp:extent cx="5350665" cy="7491046"/>
+            <wp:effectExtent l="0" t="0" r="0" b="2540"/>
             <wp:docPr id="1534583324" name="Picture 1" descr="A screenshot of a graph&#10;&#10;Description automatically generated"/>
             <wp:cNvGraphicFramePr>
               <a:graphicFrameLocks xmlns:a="http://schemas.openxmlformats.org/drawingml/2006/main" noChangeAspect="1"/>
@@ -3556,7 +4545,7 @@
                   <pic:spPr>
                     <a:xfrm>
                       <a:off x="0" y="0"/>
-                      <a:ext cx="5878195" cy="8229600"/>
+                      <a:ext cx="5356740" cy="7499552"/>
                     </a:xfrm>
                     <a:prstGeom prst="rect">
                       <a:avLst/>
@@ -3569,9 +4558,106 @@
         </w:drawing>
       </w:r>
     </w:p>
+    <w:p>
+      <w:r>
+        <w:rPr>
+          <w:noProof/>
+        </w:rPr>
+        <w:lastRenderedPageBreak/>
+        <w:drawing>
+          <wp:inline distT="0" distB="0" distL="0" distR="0" wp14:anchorId="4DEE5B82" wp14:editId="613989E2">
+            <wp:extent cx="5943600" cy="4457700"/>
+            <wp:effectExtent l="0" t="0" r="0" b="0"/>
+            <wp:docPr id="923526258" name="Picture 2" descr="A graph of different types of graphs&#10;&#10;Description automatically generated with medium confidence"/>
+            <wp:cNvGraphicFramePr>
+              <a:graphicFrameLocks xmlns:a="http://schemas.openxmlformats.org/drawingml/2006/main" noChangeAspect="1"/>
+            </wp:cNvGraphicFramePr>
+            <a:graphic xmlns:a="http://schemas.openxmlformats.org/drawingml/2006/main">
+              <a:graphicData uri="http://schemas.openxmlformats.org/drawingml/2006/picture">
+                <pic:pic xmlns:pic="http://schemas.openxmlformats.org/drawingml/2006/picture">
+                  <pic:nvPicPr>
+                    <pic:cNvPr id="923526258" name="Picture 2" descr="A graph of different types of graphs&#10;&#10;Description automatically generated with medium confidence"/>
+                    <pic:cNvPicPr/>
+                  </pic:nvPicPr>
+                  <pic:blipFill>
+                    <a:blip r:embed="rId5" cstate="print">
+                      <a:extLst>
+                        <a:ext uri="{28A0092B-C50C-407E-A947-70E740481C1C}">
+                          <a14:useLocalDpi xmlns:a14="http://schemas.microsoft.com/office/drawing/2010/main" val="0"/>
+                        </a:ext>
+                      </a:extLst>
+                    </a:blip>
+                    <a:stretch>
+                      <a:fillRect/>
+                    </a:stretch>
+                  </pic:blipFill>
+                  <pic:spPr>
+                    <a:xfrm>
+                      <a:off x="0" y="0"/>
+                      <a:ext cx="5943600" cy="4457700"/>
+                    </a:xfrm>
+                    <a:prstGeom prst="rect">
+                      <a:avLst/>
+                    </a:prstGeom>
+                  </pic:spPr>
+                </pic:pic>
+              </a:graphicData>
+            </a:graphic>
+          </wp:inline>
+        </w:drawing>
+      </w:r>
+    </w:p>
     <w:p/>
     <w:p/>
-    <w:p/>
+    <w:p>
+      <w:r>
+        <w:rPr>
+          <w:noProof/>
+        </w:rPr>
+        <w:lastRenderedPageBreak/>
+        <w:drawing>
+          <wp:inline distT="0" distB="0" distL="0" distR="0" wp14:anchorId="3BFB4E7E" wp14:editId="3449B193">
+            <wp:extent cx="5943600" cy="4457700"/>
+            <wp:effectExtent l="0" t="0" r="0" b="0"/>
+            <wp:docPr id="935982076" name="Picture 3" descr="A group of graphs showing different types of data&#10;&#10;Description automatically generated with medium confidence"/>
+            <wp:cNvGraphicFramePr>
+              <a:graphicFrameLocks xmlns:a="http://schemas.openxmlformats.org/drawingml/2006/main" noChangeAspect="1"/>
+            </wp:cNvGraphicFramePr>
+            <a:graphic xmlns:a="http://schemas.openxmlformats.org/drawingml/2006/main">
+              <a:graphicData uri="http://schemas.openxmlformats.org/drawingml/2006/picture">
+                <pic:pic xmlns:pic="http://schemas.openxmlformats.org/drawingml/2006/picture">
+                  <pic:nvPicPr>
+                    <pic:cNvPr id="935982076" name="Picture 3" descr="A group of graphs showing different types of data&#10;&#10;Description automatically generated with medium confidence"/>
+                    <pic:cNvPicPr/>
+                  </pic:nvPicPr>
+                  <pic:blipFill>
+                    <a:blip r:embed="rId6" cstate="print">
+                      <a:extLst>
+                        <a:ext uri="{28A0092B-C50C-407E-A947-70E740481C1C}">
+                          <a14:useLocalDpi xmlns:a14="http://schemas.microsoft.com/office/drawing/2010/main" val="0"/>
+                        </a:ext>
+                      </a:extLst>
+                    </a:blip>
+                    <a:stretch>
+                      <a:fillRect/>
+                    </a:stretch>
+                  </pic:blipFill>
+                  <pic:spPr>
+                    <a:xfrm>
+                      <a:off x="0" y="0"/>
+                      <a:ext cx="5943600" cy="4457700"/>
+                    </a:xfrm>
+                    <a:prstGeom prst="rect">
+                      <a:avLst/>
+                    </a:prstGeom>
+                  </pic:spPr>
+                </pic:pic>
+              </a:graphicData>
+            </a:graphic>
+          </wp:inline>
+        </w:drawing>
+      </w:r>
+    </w:p>
     <w:p/>
     <w:p>
       <w:r>
@@ -3816,10 +4902,7 @@
           </w:tcPr>
           <w:p>
             <w:r>
-              <w:t xml:space="preserve">Maximum parasite biomass-induced activation rate of </w:t>
-            </w:r>
-            <w:r>
-              <w:t>Th-</w:t>
+              <w:t>Maximum parasite biomass-induced activation rate of Th-</w:t>
             </w:r>
             <m:oMath>
               <m:r>
@@ -3883,13 +4966,7 @@
                   <w:rPr>
                     <w:rFonts w:ascii="Cambria Math" w:hAnsi="Cambria Math"/>
                   </w:rPr>
-                  <m:t>=</m:t>
-                </m:r>
-                <m:r>
-                  <w:rPr>
-                    <w:rFonts w:ascii="Cambria Math" w:hAnsi="Cambria Math"/>
-                  </w:rPr>
-                  <m:t xml:space="preserve">50, </m:t>
+                  <m:t xml:space="preserve">=50, </m:t>
                 </m:r>
               </m:oMath>
             </m:oMathPara>
@@ -3927,13 +5004,7 @@
                   <w:rPr>
                     <w:rFonts w:ascii="Cambria Math" w:hAnsi="Cambria Math"/>
                   </w:rPr>
-                  <m:t>=</m:t>
-                </m:r>
-                <m:r>
-                  <w:rPr>
-                    <w:rFonts w:ascii="Cambria Math" w:hAnsi="Cambria Math"/>
-                  </w:rPr>
-                  <m:t>130</m:t>
+                  <m:t>=130</m:t>
                 </m:r>
               </m:oMath>
             </m:oMathPara>
@@ -4057,13 +5128,7 @@
                   <w:rPr>
                     <w:rFonts w:ascii="Cambria Math" w:hAnsi="Cambria Math"/>
                   </w:rPr>
-                  <m:t>=</m:t>
-                </m:r>
-                <m:r>
-                  <w:rPr>
-                    <w:rFonts w:ascii="Cambria Math" w:hAnsi="Cambria Math"/>
-                  </w:rPr>
-                  <m:t>50</m:t>
+                  <m:t>=50</m:t>
                 </m:r>
               </m:oMath>
             </m:oMathPara>
@@ -4114,10 +5179,7 @@
           </w:tcPr>
           <w:p>
             <w:r>
-              <w:t xml:space="preserve">Maximum self-activation rate of </w:t>
-            </w:r>
-            <w:r>
-              <w:t>Th-</w:t>
+              <w:t>Maximum self-activation rate of Th-</w:t>
             </w:r>
             <m:oMath>
               <m:r>
@@ -4208,13 +5270,7 @@
                   <w:rPr>
                     <w:rFonts w:ascii="Cambria Math" w:hAnsi="Cambria Math"/>
                   </w:rPr>
-                  <m:t>=</m:t>
-                </m:r>
-                <m:r>
-                  <w:rPr>
-                    <w:rFonts w:ascii="Cambria Math" w:hAnsi="Cambria Math"/>
-                  </w:rPr>
-                  <m:t>2000</m:t>
+                  <m:t>=2000</m:t>
                 </m:r>
               </m:oMath>
             </m:oMathPara>
@@ -4338,13 +5394,7 @@
                   <w:rPr>
                     <w:rFonts w:ascii="Cambria Math" w:hAnsi="Cambria Math"/>
                   </w:rPr>
-                  <m:t>=1</m:t>
-                </m:r>
-                <m:r>
-                  <w:rPr>
-                    <w:rFonts w:ascii="Cambria Math" w:hAnsi="Cambria Math"/>
-                  </w:rPr>
-                  <m:t>000</m:t>
+                  <m:t>=1000</m:t>
                 </m:r>
               </m:oMath>
             </m:oMathPara>
@@ -4381,13 +5431,7 @@
                       <w:rPr>
                         <w:rFonts w:ascii="Cambria Math" w:hAnsi="Cambria Math"/>
                       </w:rPr>
-                      <m:t>i</m:t>
-                    </m:r>
-                    <m:r>
-                      <w:rPr>
-                        <w:rFonts w:ascii="Cambria Math" w:hAnsi="Cambria Math"/>
-                      </w:rPr>
-                      <m:t>j</m:t>
+                      <m:t>ij</m:t>
                     </m:r>
                   </m:sub>
                 </m:sSub>
@@ -4434,13 +5478,7 @@
                       <w:rPr>
                         <w:rFonts w:ascii="Cambria Math" w:hAnsi="Cambria Math"/>
                       </w:rPr>
-                      <m:t>1</m:t>
-                    </m:r>
-                    <m:r>
-                      <w:rPr>
-                        <w:rFonts w:ascii="Cambria Math" w:hAnsi="Cambria Math"/>
-                      </w:rPr>
-                      <m:t>2</m:t>
+                      <m:t>12</m:t>
                     </m:r>
                   </m:sub>
                 </m:sSub>
@@ -4472,13 +5510,7 @@
                       <w:rPr>
                         <w:rFonts w:ascii="Cambria Math" w:hAnsi="Cambria Math"/>
                       </w:rPr>
-                      <m:t>2</m:t>
-                    </m:r>
-                    <m:r>
-                      <w:rPr>
-                        <w:rFonts w:ascii="Cambria Math" w:hAnsi="Cambria Math"/>
-                      </w:rPr>
-                      <m:t>1</m:t>
+                      <m:t>21</m:t>
                     </m:r>
                   </m:sub>
                 </m:sSub>
@@ -4486,13 +5518,7 @@
                   <w:rPr>
                     <w:rFonts w:ascii="Cambria Math" w:hAnsi="Cambria Math"/>
                   </w:rPr>
-                  <m:t>=1</m:t>
-                </m:r>
-                <m:r>
-                  <w:rPr>
-                    <w:rFonts w:ascii="Cambria Math" w:hAnsi="Cambria Math"/>
-                  </w:rPr>
-                  <m:t>0,000</m:t>
+                  <m:t>=10,000</m:t>
                 </m:r>
               </m:oMath>
             </m:oMathPara>
@@ -4511,6 +5537,7 @@
                   <w:rPr>
                     <w:rFonts w:ascii="Cambria Math" w:hAnsi="Cambria Math"/>
                   </w:rPr>
+                  <w:lastRenderedPageBreak/>
                   <m:t>m</m:t>
                 </m:r>
               </m:oMath>
@@ -4538,19 +5565,7 @@
                   <w:rPr>
                     <w:rFonts w:ascii="Cambria Math" w:hAnsi="Cambria Math"/>
                   </w:rPr>
-                  <m:t>m</m:t>
-                </m:r>
-                <m:r>
-                  <w:rPr>
-                    <w:rFonts w:ascii="Cambria Math" w:hAnsi="Cambria Math"/>
-                  </w:rPr>
-                  <m:t>=0.</m:t>
-                </m:r>
-                <m:r>
-                  <w:rPr>
-                    <w:rFonts w:ascii="Cambria Math" w:hAnsi="Cambria Math"/>
-                  </w:rPr>
-                  <m:t>9</m:t>
+                  <m:t>m=0.9</m:t>
                 </m:r>
               </m:oMath>
             </m:oMathPara>
@@ -4596,13 +5611,7 @@
                   <w:rPr>
                     <w:rFonts w:ascii="Cambria Math" w:hAnsi="Cambria Math"/>
                   </w:rPr>
-                  <m:t>r</m:t>
-                </m:r>
-                <m:r>
-                  <w:rPr>
-                    <w:rFonts w:ascii="Cambria Math" w:hAnsi="Cambria Math"/>
-                  </w:rPr>
-                  <m:t>=8</m:t>
+                  <m:t>r=8</m:t>
                 </m:r>
               </m:oMath>
             </m:oMathPara>

</xml_diff>